<commit_message>
[FIX] made the thing prettier
</commit_message>
<xml_diff>
--- a/V3/Mirko Đukić.docx
+++ b/V3/Mirko Đukić.docx
@@ -170,12 +170,7 @@
         <w:suppressLineNumbers w:val="0"/>
       </w:pPr>
       <w:r>
-        <w:t>Korisnički unos se direktno ubacuje</w:t>
-      </w:r>
-      <w:bookmarkStart w:id="0" w:name="_GoBack"/>
-      <w:bookmarkEnd w:id="0"/>
-      <w:r>
-        <w:t xml:space="preserve"> u HTML bez enkodovanja</w:t>
+        <w:t>Korisnički unos se direktno ubacuje u HTML bez enkodovanja</w:t>
       </w:r>
     </w:p>
     <w:p>
@@ -1137,6 +1132,279 @@
           <w:lang w:val="en-US"/>
         </w:rPr>
       </w:pPr>
+    </w:p>
+    <w:p>
+      <w:pPr>
+        <w:jc w:val="left"/>
+        <w:rPr>
+          <w:rFonts w:hint="default"/>
+          <w:b w:val="0"/>
+          <w:bCs w:val="0"/>
+          <w:sz w:val="20"/>
+          <w:szCs w:val="20"/>
+          <w:lang w:val="en-US"/>
+        </w:rPr>
+      </w:pPr>
+    </w:p>
+    <w:p>
+      <w:pPr>
+        <w:jc w:val="left"/>
+        <w:rPr>
+          <w:rFonts w:hint="default"/>
+          <w:b w:val="0"/>
+          <w:bCs w:val="0"/>
+          <w:sz w:val="20"/>
+          <w:szCs w:val="20"/>
+          <w:lang w:val="en-US"/>
+        </w:rPr>
+      </w:pPr>
+    </w:p>
+    <w:p>
+      <w:pPr>
+        <w:jc w:val="left"/>
+        <w:rPr>
+          <w:rFonts w:hint="default"/>
+          <w:b w:val="0"/>
+          <w:bCs w:val="0"/>
+          <w:sz w:val="20"/>
+          <w:szCs w:val="20"/>
+          <w:lang w:val="en-US"/>
+        </w:rPr>
+      </w:pPr>
+    </w:p>
+    <w:p>
+      <w:pPr>
+        <w:jc w:val="left"/>
+        <w:rPr>
+          <w:rFonts w:hint="default"/>
+          <w:b w:val="0"/>
+          <w:bCs w:val="0"/>
+          <w:sz w:val="20"/>
+          <w:szCs w:val="20"/>
+          <w:lang w:val="en-US"/>
+        </w:rPr>
+      </w:pPr>
+    </w:p>
+    <w:p>
+      <w:pPr>
+        <w:jc w:val="left"/>
+        <w:rPr>
+          <w:rFonts w:hint="default"/>
+          <w:b w:val="0"/>
+          <w:bCs w:val="0"/>
+          <w:sz w:val="20"/>
+          <w:szCs w:val="20"/>
+          <w:lang w:val="en-US"/>
+        </w:rPr>
+      </w:pPr>
+    </w:p>
+    <w:p>
+      <w:pPr>
+        <w:jc w:val="left"/>
+        <w:rPr>
+          <w:rFonts w:hint="default"/>
+          <w:b w:val="0"/>
+          <w:bCs w:val="0"/>
+          <w:sz w:val="20"/>
+          <w:szCs w:val="20"/>
+          <w:lang w:val="en-US"/>
+        </w:rPr>
+      </w:pPr>
+    </w:p>
+    <w:p>
+      <w:pPr>
+        <w:jc w:val="left"/>
+        <w:rPr>
+          <w:rFonts w:hint="default"/>
+          <w:b w:val="0"/>
+          <w:bCs w:val="0"/>
+          <w:sz w:val="20"/>
+          <w:szCs w:val="20"/>
+          <w:lang w:val="en-US"/>
+        </w:rPr>
+      </w:pPr>
+    </w:p>
+    <w:p>
+      <w:pPr>
+        <w:jc w:val="left"/>
+        <w:rPr>
+          <w:rFonts w:hint="default"/>
+          <w:b w:val="0"/>
+          <w:bCs w:val="0"/>
+          <w:sz w:val="20"/>
+          <w:szCs w:val="20"/>
+          <w:lang w:val="en-US"/>
+        </w:rPr>
+      </w:pPr>
+    </w:p>
+    <w:p>
+      <w:pPr>
+        <w:jc w:val="left"/>
+        <w:rPr>
+          <w:rFonts w:hint="default"/>
+          <w:b w:val="0"/>
+          <w:bCs w:val="0"/>
+          <w:sz w:val="20"/>
+          <w:szCs w:val="20"/>
+          <w:lang w:val="en-US"/>
+        </w:rPr>
+      </w:pPr>
+    </w:p>
+    <w:p>
+      <w:pPr>
+        <w:jc w:val="left"/>
+        <w:rPr>
+          <w:rFonts w:hint="default"/>
+          <w:b w:val="0"/>
+          <w:bCs w:val="0"/>
+          <w:sz w:val="20"/>
+          <w:szCs w:val="20"/>
+          <w:lang w:val="en-US"/>
+        </w:rPr>
+      </w:pPr>
+    </w:p>
+    <w:p>
+      <w:pPr>
+        <w:jc w:val="left"/>
+        <w:rPr>
+          <w:rFonts w:hint="default"/>
+          <w:b w:val="0"/>
+          <w:bCs w:val="0"/>
+          <w:sz w:val="20"/>
+          <w:szCs w:val="20"/>
+          <w:lang w:val="en-US"/>
+        </w:rPr>
+      </w:pPr>
+    </w:p>
+    <w:p>
+      <w:pPr>
+        <w:jc w:val="left"/>
+        <w:rPr>
+          <w:rFonts w:hint="default"/>
+          <w:b w:val="0"/>
+          <w:bCs w:val="0"/>
+          <w:sz w:val="20"/>
+          <w:szCs w:val="20"/>
+          <w:lang w:val="en-US"/>
+        </w:rPr>
+      </w:pPr>
+    </w:p>
+    <w:p>
+      <w:pPr>
+        <w:jc w:val="left"/>
+        <w:rPr>
+          <w:rFonts w:hint="default"/>
+          <w:b w:val="0"/>
+          <w:bCs w:val="0"/>
+          <w:sz w:val="20"/>
+          <w:szCs w:val="20"/>
+          <w:lang w:val="en-US"/>
+        </w:rPr>
+      </w:pPr>
+    </w:p>
+    <w:p>
+      <w:pPr>
+        <w:jc w:val="left"/>
+        <w:rPr>
+          <w:rFonts w:hint="default"/>
+          <w:b w:val="0"/>
+          <w:bCs w:val="0"/>
+          <w:sz w:val="20"/>
+          <w:szCs w:val="20"/>
+          <w:lang w:val="en-US"/>
+        </w:rPr>
+      </w:pPr>
+    </w:p>
+    <w:p>
+      <w:pPr>
+        <w:jc w:val="left"/>
+        <w:rPr>
+          <w:rFonts w:hint="default"/>
+          <w:b w:val="0"/>
+          <w:bCs w:val="0"/>
+          <w:sz w:val="20"/>
+          <w:szCs w:val="20"/>
+          <w:lang w:val="en-US"/>
+        </w:rPr>
+      </w:pPr>
+    </w:p>
+    <w:p>
+      <w:pPr>
+        <w:jc w:val="left"/>
+        <w:rPr>
+          <w:rFonts w:hint="default"/>
+          <w:b w:val="0"/>
+          <w:bCs w:val="0"/>
+          <w:sz w:val="20"/>
+          <w:szCs w:val="20"/>
+          <w:lang w:val="en-US"/>
+        </w:rPr>
+      </w:pPr>
+    </w:p>
+    <w:p>
+      <w:pPr>
+        <w:jc w:val="left"/>
+        <w:rPr>
+          <w:rFonts w:hint="default"/>
+          <w:b w:val="0"/>
+          <w:bCs w:val="0"/>
+          <w:sz w:val="20"/>
+          <w:szCs w:val="20"/>
+          <w:lang w:val="en-US"/>
+        </w:rPr>
+      </w:pPr>
+    </w:p>
+    <w:p>
+      <w:pPr>
+        <w:jc w:val="left"/>
+        <w:rPr>
+          <w:rFonts w:hint="default"/>
+          <w:b w:val="0"/>
+          <w:bCs w:val="0"/>
+          <w:sz w:val="20"/>
+          <w:szCs w:val="20"/>
+          <w:lang w:val="en-US"/>
+        </w:rPr>
+      </w:pPr>
+    </w:p>
+    <w:p>
+      <w:pPr>
+        <w:jc w:val="left"/>
+        <w:rPr>
+          <w:rFonts w:hint="default"/>
+          <w:b w:val="0"/>
+          <w:bCs w:val="0"/>
+          <w:sz w:val="20"/>
+          <w:szCs w:val="20"/>
+          <w:lang w:val="en-US"/>
+        </w:rPr>
+      </w:pPr>
+    </w:p>
+    <w:p>
+      <w:pPr>
+        <w:jc w:val="left"/>
+        <w:rPr>
+          <w:rFonts w:hint="default"/>
+          <w:b w:val="0"/>
+          <w:bCs w:val="0"/>
+          <w:sz w:val="20"/>
+          <w:szCs w:val="20"/>
+          <w:lang w:val="en-US"/>
+        </w:rPr>
+      </w:pPr>
+    </w:p>
+    <w:p>
+      <w:pPr>
+        <w:jc w:val="left"/>
+        <w:rPr>
+          <w:rFonts w:hint="default"/>
+          <w:b w:val="0"/>
+          <w:bCs w:val="0"/>
+          <w:sz w:val="20"/>
+          <w:szCs w:val="20"/>
+          <w:lang w:val="en-US"/>
+        </w:rPr>
+      </w:pPr>
       <w:r>
         <w:rPr>
           <w:rFonts w:hint="default"/>
@@ -1569,7 +1837,7 @@
     </w:p>
     <w:p>
       <w:pPr>
-        <w:jc w:val="center"/>
+        <w:jc w:val="both"/>
         <w:rPr>
           <w:rFonts w:hint="default"/>
           <w:b/>
@@ -1595,163 +1863,8 @@
     </w:p>
     <w:p>
       <w:pPr>
-        <w:jc w:val="center"/>
-        <w:rPr>
-          <w:rFonts w:hint="default"/>
-          <w:b/>
-          <w:bCs/>
-          <w:sz w:val="40"/>
-          <w:szCs w:val="40"/>
-          <w:lang w:val="en-US"/>
-        </w:rPr>
-      </w:pPr>
-    </w:p>
-    <w:p>
-      <w:pPr>
-        <w:jc w:val="center"/>
-        <w:rPr>
-          <w:rFonts w:hint="default"/>
-          <w:b/>
-          <w:bCs/>
-          <w:sz w:val="40"/>
-          <w:szCs w:val="40"/>
-          <w:lang w:val="en-US"/>
-        </w:rPr>
-      </w:pPr>
-    </w:p>
-    <w:p>
-      <w:pPr>
-        <w:jc w:val="center"/>
-        <w:rPr>
-          <w:rFonts w:hint="default"/>
-          <w:b/>
-          <w:bCs/>
-          <w:sz w:val="40"/>
-          <w:szCs w:val="40"/>
-          <w:lang w:val="en-US"/>
-        </w:rPr>
-      </w:pPr>
-    </w:p>
-    <w:p>
-      <w:pPr>
-        <w:jc w:val="center"/>
-        <w:rPr>
-          <w:rFonts w:hint="default"/>
-          <w:b/>
-          <w:bCs/>
-          <w:sz w:val="40"/>
-          <w:szCs w:val="40"/>
-          <w:lang w:val="en-US"/>
-        </w:rPr>
-      </w:pPr>
-    </w:p>
-    <w:p>
-      <w:pPr>
-        <w:jc w:val="center"/>
-        <w:rPr>
-          <w:rFonts w:hint="default"/>
-          <w:b/>
-          <w:bCs/>
-          <w:sz w:val="40"/>
-          <w:szCs w:val="40"/>
-          <w:lang w:val="en-US"/>
-        </w:rPr>
-      </w:pPr>
-    </w:p>
-    <w:p>
-      <w:pPr>
-        <w:jc w:val="center"/>
-        <w:rPr>
-          <w:rFonts w:hint="default"/>
-          <w:b/>
-          <w:bCs/>
-          <w:sz w:val="40"/>
-          <w:szCs w:val="40"/>
-          <w:lang w:val="en-US"/>
-        </w:rPr>
-      </w:pPr>
-    </w:p>
-    <w:p>
-      <w:pPr>
-        <w:jc w:val="center"/>
-        <w:rPr>
-          <w:rFonts w:hint="default"/>
-          <w:b/>
-          <w:bCs/>
-          <w:sz w:val="40"/>
-          <w:szCs w:val="40"/>
-          <w:lang w:val="en-US"/>
-        </w:rPr>
-      </w:pPr>
-    </w:p>
-    <w:p>
-      <w:pPr>
-        <w:jc w:val="center"/>
-        <w:rPr>
-          <w:rFonts w:hint="default"/>
-          <w:b/>
-          <w:bCs/>
-          <w:sz w:val="40"/>
-          <w:szCs w:val="40"/>
-          <w:lang w:val="en-US"/>
-        </w:rPr>
-      </w:pPr>
-    </w:p>
-    <w:p>
-      <w:pPr>
-        <w:jc w:val="center"/>
-        <w:rPr>
-          <w:rFonts w:hint="default"/>
-          <w:b/>
-          <w:bCs/>
-          <w:sz w:val="40"/>
-          <w:szCs w:val="40"/>
-          <w:lang w:val="en-US"/>
-        </w:rPr>
-      </w:pPr>
-    </w:p>
-    <w:p>
-      <w:pPr>
-        <w:jc w:val="center"/>
-        <w:rPr>
-          <w:rFonts w:hint="default"/>
-          <w:b/>
-          <w:bCs/>
-          <w:sz w:val="40"/>
-          <w:szCs w:val="40"/>
-          <w:lang w:val="en-US"/>
-        </w:rPr>
-      </w:pPr>
-    </w:p>
-    <w:p>
-      <w:pPr>
-        <w:jc w:val="center"/>
-        <w:rPr>
-          <w:rFonts w:hint="default"/>
-          <w:b/>
-          <w:bCs/>
-          <w:sz w:val="40"/>
-          <w:szCs w:val="40"/>
-          <w:lang w:val="en-US"/>
-        </w:rPr>
-      </w:pPr>
-    </w:p>
-    <w:p>
-      <w:pPr>
-        <w:jc w:val="center"/>
-        <w:rPr>
-          <w:rFonts w:hint="default"/>
-          <w:b/>
-          <w:bCs/>
-          <w:sz w:val="40"/>
-          <w:szCs w:val="40"/>
-          <w:lang w:val="en-US"/>
-        </w:rPr>
-      </w:pPr>
-    </w:p>
-    <w:p>
-      <w:pPr>
-        <w:jc w:val="center"/>
+        <w:ind w:firstLine="3202" w:firstLineChars="800"/>
+        <w:jc w:val="both"/>
         <w:rPr>
           <w:rFonts w:hint="default"/>
           <w:b/>
@@ -2226,6 +2339,206 @@
           <w:lang w:val="en-US"/>
         </w:rPr>
       </w:pPr>
+    </w:p>
+    <w:p>
+      <w:pPr>
+        <w:jc w:val="left"/>
+        <w:rPr>
+          <w:rFonts w:hint="default"/>
+          <w:lang w:val="en-US"/>
+        </w:rPr>
+      </w:pPr>
+    </w:p>
+    <w:p>
+      <w:pPr>
+        <w:jc w:val="left"/>
+        <w:rPr>
+          <w:rFonts w:hint="default"/>
+          <w:lang w:val="en-US"/>
+        </w:rPr>
+      </w:pPr>
+    </w:p>
+    <w:p>
+      <w:pPr>
+        <w:jc w:val="left"/>
+        <w:rPr>
+          <w:rFonts w:hint="default"/>
+          <w:lang w:val="en-US"/>
+        </w:rPr>
+      </w:pPr>
+    </w:p>
+    <w:p>
+      <w:pPr>
+        <w:jc w:val="left"/>
+        <w:rPr>
+          <w:rFonts w:hint="default"/>
+          <w:lang w:val="en-US"/>
+        </w:rPr>
+      </w:pPr>
+    </w:p>
+    <w:p>
+      <w:pPr>
+        <w:jc w:val="left"/>
+        <w:rPr>
+          <w:rFonts w:hint="default"/>
+          <w:lang w:val="en-US"/>
+        </w:rPr>
+      </w:pPr>
+    </w:p>
+    <w:p>
+      <w:pPr>
+        <w:jc w:val="left"/>
+        <w:rPr>
+          <w:rFonts w:hint="default"/>
+          <w:lang w:val="en-US"/>
+        </w:rPr>
+      </w:pPr>
+    </w:p>
+    <w:p>
+      <w:pPr>
+        <w:jc w:val="left"/>
+        <w:rPr>
+          <w:rFonts w:hint="default"/>
+          <w:lang w:val="en-US"/>
+        </w:rPr>
+      </w:pPr>
+    </w:p>
+    <w:p>
+      <w:pPr>
+        <w:jc w:val="left"/>
+        <w:rPr>
+          <w:rFonts w:hint="default"/>
+          <w:lang w:val="en-US"/>
+        </w:rPr>
+      </w:pPr>
+    </w:p>
+    <w:p>
+      <w:pPr>
+        <w:jc w:val="left"/>
+        <w:rPr>
+          <w:rFonts w:hint="default"/>
+          <w:lang w:val="en-US"/>
+        </w:rPr>
+      </w:pPr>
+    </w:p>
+    <w:p>
+      <w:pPr>
+        <w:jc w:val="left"/>
+        <w:rPr>
+          <w:rFonts w:hint="default"/>
+          <w:lang w:val="en-US"/>
+        </w:rPr>
+      </w:pPr>
+    </w:p>
+    <w:p>
+      <w:pPr>
+        <w:jc w:val="left"/>
+        <w:rPr>
+          <w:rFonts w:hint="default"/>
+          <w:lang w:val="en-US"/>
+        </w:rPr>
+      </w:pPr>
+    </w:p>
+    <w:p>
+      <w:pPr>
+        <w:jc w:val="left"/>
+        <w:rPr>
+          <w:rFonts w:hint="default"/>
+          <w:lang w:val="en-US"/>
+        </w:rPr>
+      </w:pPr>
+    </w:p>
+    <w:p>
+      <w:pPr>
+        <w:jc w:val="left"/>
+        <w:rPr>
+          <w:rFonts w:hint="default"/>
+          <w:lang w:val="en-US"/>
+        </w:rPr>
+      </w:pPr>
+    </w:p>
+    <w:p>
+      <w:pPr>
+        <w:jc w:val="left"/>
+        <w:rPr>
+          <w:rFonts w:hint="default"/>
+          <w:lang w:val="en-US"/>
+        </w:rPr>
+      </w:pPr>
+    </w:p>
+    <w:p>
+      <w:pPr>
+        <w:jc w:val="left"/>
+        <w:rPr>
+          <w:rFonts w:hint="default"/>
+          <w:lang w:val="en-US"/>
+        </w:rPr>
+      </w:pPr>
+    </w:p>
+    <w:p>
+      <w:pPr>
+        <w:jc w:val="left"/>
+        <w:rPr>
+          <w:rFonts w:hint="default"/>
+          <w:lang w:val="en-US"/>
+        </w:rPr>
+      </w:pPr>
+    </w:p>
+    <w:p>
+      <w:pPr>
+        <w:jc w:val="left"/>
+        <w:rPr>
+          <w:rFonts w:hint="default"/>
+          <w:lang w:val="en-US"/>
+        </w:rPr>
+      </w:pPr>
+    </w:p>
+    <w:p>
+      <w:pPr>
+        <w:jc w:val="left"/>
+        <w:rPr>
+          <w:rFonts w:hint="default"/>
+          <w:lang w:val="en-US"/>
+        </w:rPr>
+      </w:pPr>
+    </w:p>
+    <w:p>
+      <w:pPr>
+        <w:jc w:val="left"/>
+        <w:rPr>
+          <w:rFonts w:hint="default"/>
+          <w:lang w:val="en-US"/>
+        </w:rPr>
+      </w:pPr>
+    </w:p>
+    <w:p>
+      <w:pPr>
+        <w:jc w:val="left"/>
+        <w:rPr>
+          <w:rFonts w:hint="default"/>
+          <w:lang w:val="en-US"/>
+        </w:rPr>
+      </w:pPr>
+    </w:p>
+    <w:p>
+      <w:pPr>
+        <w:jc w:val="left"/>
+        <w:rPr>
+          <w:rFonts w:hint="default"/>
+          <w:lang w:val="en-US"/>
+        </w:rPr>
+      </w:pPr>
+    </w:p>
+    <w:p>
+      <w:pPr>
+        <w:jc w:val="left"/>
+        <w:rPr>
+          <w:rFonts w:hint="default"/>
+          <w:lang w:val="en-US"/>
+        </w:rPr>
+      </w:pPr>
+      <w:bookmarkStart w:id="0" w:name="_GoBack"/>
+      <w:bookmarkEnd w:id="0"/>
       <w:r>
         <w:rPr>
           <w:rFonts w:hint="default"/>
@@ -2402,6 +2715,295 @@
           <w:bCs w:val="0"/>
           <w:i w:val="0"/>
           <w:iCs w:val="0"/>
+          <w:color w:val="001350"/>
+          <w:spacing w:val="0"/>
+          <w:sz w:val="20"/>
+          <w:szCs w:val="20"/>
+          <w:lang w:val="en-US"/>
+        </w:rPr>
+      </w:pPr>
+    </w:p>
+    <w:p>
+      <w:pPr>
+        <w:jc w:val="both"/>
+        <w:rPr>
+          <w:rFonts w:hint="default" w:ascii="Arial" w:hAnsi="Arial" w:cs="Arial"/>
+          <w:b w:val="0"/>
+          <w:bCs w:val="0"/>
+          <w:i w:val="0"/>
+          <w:iCs w:val="0"/>
+          <w:color w:val="001350"/>
+          <w:spacing w:val="0"/>
+          <w:sz w:val="20"/>
+          <w:szCs w:val="20"/>
+          <w:lang w:val="en-US"/>
+        </w:rPr>
+      </w:pPr>
+    </w:p>
+    <w:p>
+      <w:pPr>
+        <w:jc w:val="both"/>
+        <w:rPr>
+          <w:rFonts w:hint="default" w:ascii="Arial" w:hAnsi="Arial" w:cs="Arial"/>
+          <w:b w:val="0"/>
+          <w:bCs w:val="0"/>
+          <w:i w:val="0"/>
+          <w:iCs w:val="0"/>
+          <w:color w:val="001350"/>
+          <w:spacing w:val="0"/>
+          <w:sz w:val="20"/>
+          <w:szCs w:val="20"/>
+          <w:lang w:val="en-US"/>
+        </w:rPr>
+      </w:pPr>
+    </w:p>
+    <w:p>
+      <w:pPr>
+        <w:jc w:val="both"/>
+        <w:rPr>
+          <w:rFonts w:hint="default" w:ascii="Arial" w:hAnsi="Arial" w:cs="Arial"/>
+          <w:b w:val="0"/>
+          <w:bCs w:val="0"/>
+          <w:i w:val="0"/>
+          <w:iCs w:val="0"/>
+          <w:color w:val="001350"/>
+          <w:spacing w:val="0"/>
+          <w:sz w:val="20"/>
+          <w:szCs w:val="20"/>
+          <w:lang w:val="en-US"/>
+        </w:rPr>
+      </w:pPr>
+    </w:p>
+    <w:p>
+      <w:pPr>
+        <w:jc w:val="both"/>
+        <w:rPr>
+          <w:rFonts w:hint="default" w:ascii="Arial" w:hAnsi="Arial" w:cs="Arial"/>
+          <w:b w:val="0"/>
+          <w:bCs w:val="0"/>
+          <w:i w:val="0"/>
+          <w:iCs w:val="0"/>
+          <w:color w:val="001350"/>
+          <w:spacing w:val="0"/>
+          <w:sz w:val="20"/>
+          <w:szCs w:val="20"/>
+          <w:lang w:val="en-US"/>
+        </w:rPr>
+      </w:pPr>
+    </w:p>
+    <w:p>
+      <w:pPr>
+        <w:jc w:val="both"/>
+        <w:rPr>
+          <w:rFonts w:hint="default" w:ascii="Arial" w:hAnsi="Arial" w:cs="Arial"/>
+          <w:b w:val="0"/>
+          <w:bCs w:val="0"/>
+          <w:i w:val="0"/>
+          <w:iCs w:val="0"/>
+          <w:color w:val="001350"/>
+          <w:spacing w:val="0"/>
+          <w:sz w:val="20"/>
+          <w:szCs w:val="20"/>
+          <w:lang w:val="en-US"/>
+        </w:rPr>
+      </w:pPr>
+    </w:p>
+    <w:p>
+      <w:pPr>
+        <w:jc w:val="both"/>
+        <w:rPr>
+          <w:rFonts w:hint="default" w:ascii="Arial" w:hAnsi="Arial" w:cs="Arial"/>
+          <w:b w:val="0"/>
+          <w:bCs w:val="0"/>
+          <w:i w:val="0"/>
+          <w:iCs w:val="0"/>
+          <w:color w:val="001350"/>
+          <w:spacing w:val="0"/>
+          <w:sz w:val="20"/>
+          <w:szCs w:val="20"/>
+          <w:lang w:val="en-US"/>
+        </w:rPr>
+      </w:pPr>
+    </w:p>
+    <w:p>
+      <w:pPr>
+        <w:jc w:val="both"/>
+        <w:rPr>
+          <w:rFonts w:hint="default" w:ascii="Arial" w:hAnsi="Arial" w:cs="Arial"/>
+          <w:b w:val="0"/>
+          <w:bCs w:val="0"/>
+          <w:i w:val="0"/>
+          <w:iCs w:val="0"/>
+          <w:color w:val="001350"/>
+          <w:spacing w:val="0"/>
+          <w:sz w:val="20"/>
+          <w:szCs w:val="20"/>
+          <w:lang w:val="en-US"/>
+        </w:rPr>
+      </w:pPr>
+    </w:p>
+    <w:p>
+      <w:pPr>
+        <w:jc w:val="both"/>
+        <w:rPr>
+          <w:rFonts w:hint="default" w:ascii="Arial" w:hAnsi="Arial" w:cs="Arial"/>
+          <w:b w:val="0"/>
+          <w:bCs w:val="0"/>
+          <w:i w:val="0"/>
+          <w:iCs w:val="0"/>
+          <w:color w:val="001350"/>
+          <w:spacing w:val="0"/>
+          <w:sz w:val="20"/>
+          <w:szCs w:val="20"/>
+          <w:lang w:val="en-US"/>
+        </w:rPr>
+      </w:pPr>
+    </w:p>
+    <w:p>
+      <w:pPr>
+        <w:jc w:val="both"/>
+        <w:rPr>
+          <w:rFonts w:hint="default" w:ascii="Arial" w:hAnsi="Arial" w:cs="Arial"/>
+          <w:b w:val="0"/>
+          <w:bCs w:val="0"/>
+          <w:i w:val="0"/>
+          <w:iCs w:val="0"/>
+          <w:color w:val="001350"/>
+          <w:spacing w:val="0"/>
+          <w:sz w:val="20"/>
+          <w:szCs w:val="20"/>
+          <w:lang w:val="en-US"/>
+        </w:rPr>
+      </w:pPr>
+    </w:p>
+    <w:p>
+      <w:pPr>
+        <w:jc w:val="both"/>
+        <w:rPr>
+          <w:rFonts w:hint="default" w:ascii="Arial" w:hAnsi="Arial" w:cs="Arial"/>
+          <w:b w:val="0"/>
+          <w:bCs w:val="0"/>
+          <w:i w:val="0"/>
+          <w:iCs w:val="0"/>
+          <w:color w:val="001350"/>
+          <w:spacing w:val="0"/>
+          <w:sz w:val="20"/>
+          <w:szCs w:val="20"/>
+          <w:lang w:val="en-US"/>
+        </w:rPr>
+      </w:pPr>
+    </w:p>
+    <w:p>
+      <w:pPr>
+        <w:jc w:val="both"/>
+        <w:rPr>
+          <w:rFonts w:hint="default" w:ascii="Arial" w:hAnsi="Arial" w:cs="Arial"/>
+          <w:b w:val="0"/>
+          <w:bCs w:val="0"/>
+          <w:i w:val="0"/>
+          <w:iCs w:val="0"/>
+          <w:color w:val="001350"/>
+          <w:spacing w:val="0"/>
+          <w:sz w:val="20"/>
+          <w:szCs w:val="20"/>
+          <w:lang w:val="en-US"/>
+        </w:rPr>
+      </w:pPr>
+    </w:p>
+    <w:p>
+      <w:pPr>
+        <w:jc w:val="both"/>
+        <w:rPr>
+          <w:rFonts w:hint="default" w:ascii="Arial" w:hAnsi="Arial" w:cs="Arial"/>
+          <w:b w:val="0"/>
+          <w:bCs w:val="0"/>
+          <w:i w:val="0"/>
+          <w:iCs w:val="0"/>
+          <w:color w:val="001350"/>
+          <w:spacing w:val="0"/>
+          <w:sz w:val="20"/>
+          <w:szCs w:val="20"/>
+          <w:lang w:val="en-US"/>
+        </w:rPr>
+      </w:pPr>
+    </w:p>
+    <w:p>
+      <w:pPr>
+        <w:jc w:val="both"/>
+        <w:rPr>
+          <w:rFonts w:hint="default" w:ascii="Arial" w:hAnsi="Arial" w:cs="Arial"/>
+          <w:b w:val="0"/>
+          <w:bCs w:val="0"/>
+          <w:i w:val="0"/>
+          <w:iCs w:val="0"/>
+          <w:color w:val="001350"/>
+          <w:spacing w:val="0"/>
+          <w:sz w:val="20"/>
+          <w:szCs w:val="20"/>
+          <w:lang w:val="en-US"/>
+        </w:rPr>
+      </w:pPr>
+    </w:p>
+    <w:p>
+      <w:pPr>
+        <w:jc w:val="both"/>
+        <w:rPr>
+          <w:rFonts w:hint="default" w:ascii="Arial" w:hAnsi="Arial" w:cs="Arial"/>
+          <w:b w:val="0"/>
+          <w:bCs w:val="0"/>
+          <w:i w:val="0"/>
+          <w:iCs w:val="0"/>
+          <w:color w:val="001350"/>
+          <w:spacing w:val="0"/>
+          <w:sz w:val="20"/>
+          <w:szCs w:val="20"/>
+          <w:lang w:val="en-US"/>
+        </w:rPr>
+      </w:pPr>
+    </w:p>
+    <w:p>
+      <w:pPr>
+        <w:jc w:val="both"/>
+        <w:rPr>
+          <w:rFonts w:hint="default" w:ascii="Arial" w:hAnsi="Arial" w:cs="Arial"/>
+          <w:b w:val="0"/>
+          <w:bCs w:val="0"/>
+          <w:i w:val="0"/>
+          <w:iCs w:val="0"/>
+          <w:color w:val="001350"/>
+          <w:spacing w:val="0"/>
+          <w:sz w:val="20"/>
+          <w:szCs w:val="20"/>
+          <w:lang w:val="en-US"/>
+        </w:rPr>
+      </w:pPr>
+    </w:p>
+    <w:p>
+      <w:pPr>
+        <w:jc w:val="both"/>
+        <w:rPr>
+          <w:rFonts w:hint="default" w:ascii="Arial" w:hAnsi="Arial" w:cs="Arial"/>
+          <w:b w:val="0"/>
+          <w:bCs w:val="0"/>
+          <w:i w:val="0"/>
+          <w:iCs w:val="0"/>
+          <w:color w:val="001350"/>
+          <w:spacing w:val="0"/>
+          <w:sz w:val="20"/>
+          <w:szCs w:val="20"/>
+          <w:lang w:val="en-US"/>
+        </w:rPr>
+      </w:pPr>
+    </w:p>
+    <w:p>
+      <w:pPr>
+        <w:jc w:val="both"/>
+        <w:rPr>
+          <w:rFonts w:hint="default" w:ascii="Arial" w:hAnsi="Arial" w:cs="Arial"/>
+          <w:b w:val="0"/>
+          <w:bCs w:val="0"/>
+          <w:i w:val="0"/>
+          <w:iCs w:val="0"/>
           <w:caps w:val="0"/>
           <w:color w:val="001350"/>
           <w:spacing w:val="0"/>
@@ -2610,6 +3212,168 @@
     <w:p>
       <w:pPr>
         <w:jc w:val="both"/>
+      </w:pPr>
+    </w:p>
+    <w:p>
+      <w:pPr>
+        <w:jc w:val="both"/>
+        <w:rPr>
+          <w:rFonts w:hint="default"/>
+          <w:lang w:val="en-US"/>
+        </w:rPr>
+      </w:pPr>
+    </w:p>
+    <w:p>
+      <w:pPr>
+        <w:jc w:val="both"/>
+        <w:rPr>
+          <w:rFonts w:hint="default"/>
+          <w:lang w:val="en-US"/>
+        </w:rPr>
+      </w:pPr>
+    </w:p>
+    <w:p>
+      <w:pPr>
+        <w:jc w:val="both"/>
+        <w:rPr>
+          <w:rFonts w:hint="default"/>
+          <w:lang w:val="en-US"/>
+        </w:rPr>
+      </w:pPr>
+    </w:p>
+    <w:p>
+      <w:pPr>
+        <w:jc w:val="both"/>
+        <w:rPr>
+          <w:rFonts w:hint="default"/>
+          <w:lang w:val="en-US"/>
+        </w:rPr>
+      </w:pPr>
+    </w:p>
+    <w:p>
+      <w:pPr>
+        <w:jc w:val="both"/>
+        <w:rPr>
+          <w:rFonts w:hint="default"/>
+          <w:lang w:val="en-US"/>
+        </w:rPr>
+      </w:pPr>
+    </w:p>
+    <w:p>
+      <w:pPr>
+        <w:jc w:val="both"/>
+        <w:rPr>
+          <w:rFonts w:hint="default"/>
+          <w:lang w:val="en-US"/>
+        </w:rPr>
+      </w:pPr>
+    </w:p>
+    <w:p>
+      <w:pPr>
+        <w:jc w:val="both"/>
+        <w:rPr>
+          <w:rFonts w:hint="default"/>
+          <w:lang w:val="en-US"/>
+        </w:rPr>
+      </w:pPr>
+    </w:p>
+    <w:p>
+      <w:pPr>
+        <w:jc w:val="both"/>
+        <w:rPr>
+          <w:rFonts w:hint="default"/>
+          <w:lang w:val="en-US"/>
+        </w:rPr>
+      </w:pPr>
+    </w:p>
+    <w:p>
+      <w:pPr>
+        <w:jc w:val="both"/>
+        <w:rPr>
+          <w:rFonts w:hint="default"/>
+          <w:lang w:val="en-US"/>
+        </w:rPr>
+      </w:pPr>
+    </w:p>
+    <w:p>
+      <w:pPr>
+        <w:jc w:val="both"/>
+        <w:rPr>
+          <w:rFonts w:hint="default"/>
+          <w:lang w:val="en-US"/>
+        </w:rPr>
+      </w:pPr>
+    </w:p>
+    <w:p>
+      <w:pPr>
+        <w:jc w:val="both"/>
+        <w:rPr>
+          <w:rFonts w:hint="default"/>
+          <w:lang w:val="en-US"/>
+        </w:rPr>
+      </w:pPr>
+    </w:p>
+    <w:p>
+      <w:pPr>
+        <w:jc w:val="both"/>
+        <w:rPr>
+          <w:rFonts w:hint="default"/>
+          <w:lang w:val="en-US"/>
+        </w:rPr>
+      </w:pPr>
+    </w:p>
+    <w:p>
+      <w:pPr>
+        <w:jc w:val="both"/>
+        <w:rPr>
+          <w:rFonts w:hint="default"/>
+          <w:lang w:val="en-US"/>
+        </w:rPr>
+      </w:pPr>
+    </w:p>
+    <w:p>
+      <w:pPr>
+        <w:jc w:val="both"/>
+        <w:rPr>
+          <w:rFonts w:hint="default"/>
+          <w:lang w:val="en-US"/>
+        </w:rPr>
+      </w:pPr>
+    </w:p>
+    <w:p>
+      <w:pPr>
+        <w:jc w:val="both"/>
+        <w:rPr>
+          <w:rFonts w:hint="default"/>
+          <w:lang w:val="en-US"/>
+        </w:rPr>
+      </w:pPr>
+    </w:p>
+    <w:p>
+      <w:pPr>
+        <w:jc w:val="both"/>
+        <w:rPr>
+          <w:rFonts w:hint="default"/>
+          <w:lang w:val="en-US"/>
+        </w:rPr>
+      </w:pPr>
+    </w:p>
+    <w:p>
+      <w:pPr>
+        <w:jc w:val="both"/>
+        <w:rPr>
+          <w:rFonts w:hint="default"/>
+          <w:lang w:val="en-US"/>
+        </w:rPr>
+      </w:pPr>
+    </w:p>
+    <w:p>
+      <w:pPr>
+        <w:jc w:val="both"/>
+        <w:rPr>
+          <w:rFonts w:hint="default"/>
+          <w:lang w:val="en-US"/>
+        </w:rPr>
       </w:pPr>
     </w:p>
     <w:p>

</xml_diff>